<commit_message>
fiscalite : rapport commun, retour au texte des coauteurs sur les points non discutés
Majuscules après deux-points, style du paragraphe d'ouverture du chapitre
sur la dépense et ponctuation du bullet de Léo rétablis tels qu'ils
figuraient dans la version relue.

Co-Authored-By: Claude Opus 5.5 <noreply@anthropic.com>
Claude-Session: https://claude.ai/code/session_01SW7mKrk2bK8EYwjJ4TJnMY
</commit_message>
<xml_diff>
--- a/fiscalite/rapport_commun.docx
+++ b/fiscalite/rapport_commun.docx
@@ -280,7 +280,7 @@
           <w:bCs/>
           <w:lang w:val="fr-FR"/>
         </w:rPr>
-        <w:t xml:space="preserve">Contrôle de l’emploi : un système fiscal doit être pensé pour financer, avec le moins de distorsion possible, un ensemble de dépenses publiques répondant à des choix collectifs.</w:t>
+        <w:t xml:space="preserve">Contrôle de l’emploi : Un système fiscal doit être pensé pour financer, avec le moins de distorsion possible, un ensemble de dépenses publiques répondant à des choix collectifs.</w:t>
       </w:r>
       <w:r>
         <w:rPr>
@@ -513,7 +513,7 @@
         <w:rPr>
           <w:lang w:val="fr-FR"/>
         </w:rPr>
-        <w:t xml:space="preserve"> Pourquoi privilégier des assiettes larges et des taux bas ? Intuition du coût quadratique (sans le mentionner, bien sûr). Pourquoi rechercher la neutralité fiscale, éviter de taxer les intrants et privilégier les assiettes peu élastiques (règle de Ramsey) ? Introduire la fiscalité pigouvienne, et le classement des impôts selon leurs effets sur la croissance établi par l’OCDE.</w:t>
+        <w:t xml:space="preserve"> Pourquoi privilégier des assiettes larges et des taux bas ? Intuition du coût quadratique (sans le mentionner, bien sûr). Pourquoi rechercher la neutralité fiscale, éviter de taxer les intrants et privilégier les assiettes peu élastiques (Règle de Ramsey) ? Introduire la fiscalité pigouvienne, et le classement des impôts selon leurs effets sur la croissance établi par l’OCDE.</w:t>
       </w:r>
       <w:r>
         <w:rPr>
@@ -1072,7 +1072,7 @@
         <w:rPr>
           <w:lang w:val="fr-FR"/>
         </w:rPr>
-        <w:t xml:space="preserve"> Je mets qq chiffres en commentaire.</w:t>
+        <w:t xml:space="preserve"> Je mets qq chiffres en commentaire</w:t>
       </w:r>
       <w:r>
         <w:rPr>
@@ -1096,19 +1096,12 @@
         <w:rPr>
           <w:lang w:val="fr-FR"/>
         </w:rPr>
-        <w:t xml:space="preserve">  Repartir de la dépense : combien faut-il prélever ?</w:t>
-      </w:r>
-    </w:p>
-    <w:p>
-      <w:pPr>
-        <w:keepNext/>
-        <w:spacing w:after="100"/>
-      </w:pPr>
-      <w:r>
-        <w:rPr>
-          <w:i/>
-          <w:iCs/>
-          <w:color w:val="5F6368"/>
+        <w:t xml:space="preserve">  Repartir de la dépense : Combien faut-il prélever ?</w:t>
+      </w:r>
+    </w:p>
+    <w:p>
+      <w:r>
+        <w:rPr>
           <w:lang w:val="fr-FR"/>
         </w:rPr>
         <w:t xml:space="preserve">Avant de définir la structure, il faut se poser la question du niveau : l’impôt est le prix d’une dépense, et l’on ne peut pas dessiner le bon système sans savoir combien il doit financer.</w:t>

</xml_diff>

<commit_message>
fiscalite : rapport commun aligné sur la version décidée ensemble
Retour au texte commun partout, sauf : encadré sur la fiscalité des
transmissions reprenant les quatre principes avec un rappel des
difficultés politiques et économiques, IS progressif mentionné comme
objet de débat, face-à-face sur l'héritage réduit au rejet par
l'opinion. Les commentaires de fond de Léo deviennent des notes de bas
de page, numérotées dans l'ordre d'apparition.

Co-Authored-By: Claude Opus 5.5 <noreply@anthropic.com>
Claude-Session: https://claude.ai/code/session_01SW7mKrk2bK8EYwjJ4TJnMY
</commit_message>
<xml_diff>
--- a/fiscalite/rapport_commun.docx
+++ b/fiscalite/rapport_commun.docx
@@ -106,7 +106,7 @@
         <w:rPr>
           <w:lang w:val="fr-FR"/>
         </w:rPr>
-        <w:t xml:space="preserve">À niveau de recettes et de redistribution donnés, toutes les architectures fiscales ne se valent pas. Il est possible de concevoir un système plus simple, plus neutre et moins destructeur d’activité sans renoncer à ses objectifs de justice ou de financement. Aujourd’hui, la France prélève beaucoup parce qu’elle dépense beaucoup, et elle prélève mal : trop sur le travail et la production, pas assez sur la consommation, et sur la transmission de façon aussi lourde en théorie que mitée en pratique. Nous proposons de rebâtir le système fiscal français pour l’adapter au </w:t>
+        <w:t xml:space="preserve">À niveau de recettes et de redistribution donnés, toutes les architectures fiscales ne se valent pas. Il est possible de concevoir un système plus simple, plus neutre et moins destructeur d’activité sans renoncer à ses objectifs de justice ou de financement. Aujourd’hui, la France prélève beaucoup parce qu’elle dépense beaucoup, et elle prélève mal : trop sur le travail et la production, pas assez sur la consommation et la transmission. Nous proposons de rebâtir le système fiscal français pour l’adapter au </w:t>
       </w:r>
       <w:r>
         <w:rPr>
@@ -614,7 +614,13 @@
           <w:lang w:val="fr-FR"/>
         </w:rPr>
         <w:br/>
-        <w:t xml:space="preserve">Le délitement : comment la France a progressivement perdu le fil de sa fiscalité</w:t>
+        <w:t xml:space="preserve">La France a progressivement perdu le fil de sa fiscalité</w:t>
+      </w:r>
+      <w:r>
+        <w:rPr>
+          <w:rStyle w:val="FootnoteReference"/>
+        </w:rPr>
+        <w:footnoteReference w:id="2"/>
       </w:r>
     </w:p>
     <w:p>
@@ -655,7 +661,7 @@
         <w:rPr>
           <w:lang w:val="fr-FR"/>
         </w:rPr>
-        <w:t xml:space="preserve"> L’État social grandit, de nouvelles dépenses apparaissent (chômage de masse et vieillissement depuis les années 1970), et les prélèvements suivent sans jamais rattraper la dépense : de 30 % du PIB en 1960 à 45 % en 2022 (Insee). Le système fiscal s’adapte par couches plutôt que par refonte : cotisations pour financer la protection sociale, puis CSG pour élargir son financement, créée en 1991 à 1,1 %, elle est devenue un second impôt sur le revenu, puis CRDS pour financer la dette sociale, créée en 1996 pour treize ans et toujours là.</w:t>
+        <w:t xml:space="preserve"> L’État social grandit, de nouvelles dépenses apparaissent — chômage de masse et vieillissement depuis les années 1970 — et les prélèvements suivent sans jamais rattraper la dépense : de 30 % du PIB en 1960 à 45 % en 2022 (Insee). Le système fiscal s’adapte par couches plutôt que par refonte : cotisations pour financer la protection sociale, puis CSG pour élargir son financement, créée en 1991 à 1,1 %, elle est devenue un second impôt sur le revenu, puis CRDS pour financer la dette sociale, créée en 1996 pour treize ans et toujours là.</w:t>
       </w:r>
     </w:p>
     <w:p>
@@ -1003,7 +1009,7 @@
         <w:rPr>
           <w:rStyle w:val="FootnoteReference"/>
         </w:rPr>
-        <w:footnoteReference w:id="2"/>
+        <w:footnoteReference w:id="3"/>
       </w:r>
     </w:p>
     <w:p>
@@ -1078,7 +1084,7 @@
         <w:rPr>
           <w:rStyle w:val="FootnoteReference"/>
         </w:rPr>
-        <w:footnoteReference w:id="3"/>
+        <w:footnoteReference w:id="4"/>
       </w:r>
     </w:p>
     <w:p>
@@ -1228,7 +1234,7 @@
         <w:rPr>
           <w:rStyle w:val="FootnoteReference"/>
         </w:rPr>
-        <w:footnoteReference w:id="4"/>
+        <w:footnoteReference w:id="5"/>
       </w:r>
     </w:p>
     <w:p>
@@ -1243,13 +1249,13 @@
           <w:color w:val="5F6368"/>
           <w:lang w:val="fr-FR"/>
         </w:rPr>
-        <w:t xml:space="preserve">Le mouvement est le suivant : voilà le système qu’on peut construire, voilà les choix qui restent ouverts à l’intérieur de ce système, voilà pourquoi il est difficile d’y arriver. Une règle la traverse (assiettes larges, taux bas, le moins de niches possible, et pas d’aide là où baisser un impôt suffit), et chaque proposition suit le même mode d’emploi : le principe, ce qu’on en attend, ce que font nos voisins, qui gagne et qui perd, comment y aller, et la réponse aux objections.</w:t>
+        <w:t xml:space="preserve">Le mouvement est le suivant : voilà le système qu’on peut construire, voilà les choix qui restent ouverts à l’intérieur de ce système, voilà pourquoi il est difficile d’y arriver. Une règle la traverse — assiettes larges, taux bas, le moins de niches possible, et pas d’aide là où baisser un impôt suffit — et chaque proposition suit le même mode d’emploi : le principe, ce qu’on en attend, ce que font nos voisins, qui gagne et qui perd, comment y aller, et la réponse aux objections.</w:t>
       </w:r>
       <w:r>
         <w:rPr>
           <w:rStyle w:val="FootnoteReference"/>
         </w:rPr>
-        <w:footnoteReference w:id="5"/>
+        <w:footnoteReference w:id="6"/>
       </w:r>
     </w:p>
     <w:p>
@@ -1305,13 +1311,13 @@
         <w:rPr>
           <w:lang w:val="fr-FR"/>
         </w:rPr>
-        <w:t xml:space="preserve"> Réduire fortement les taux réduits de TVA ; lorsque leur suppression pénalise les ménages modestes, restituer directement le gain du côté des prestations sociales plutôt que par un taux réduit bénéficiant à tous. Utiliser ensuite une hausse de la TVA, dite « sociale », pour financer une baisse des cotisations et réduire la taxation du travail.</w:t>
+        <w:t xml:space="preserve"> Réduire fortement les taux réduits de TVA ; lorsque leur suppression pénalise les ménages modestes, restituer directement le gain du côté des prestations sociales plutôt que par un taux réduit bénéficiant à tous. Utiliser ensuite une hausse de la TVA — la TVA dite « sociale » — pour financer une baisse des cotisations et réduire la taxation du travail.</w:t>
       </w:r>
       <w:r>
         <w:rPr>
           <w:rStyle w:val="FootnoteReference"/>
         </w:rPr>
-        <w:footnoteReference w:id="6"/>
+        <w:footnoteReference w:id="7"/>
       </w:r>
     </w:p>
     <w:p>
@@ -1374,13 +1380,164 @@
           <w:bCs/>
           <w:lang w:val="fr-FR"/>
         </w:rPr>
-        <w:t xml:space="preserve">Capital : rechercher la neutralité et repenser l’équilibre entre la taxation de son accumulation et celle de sa transmission.</w:t>
-      </w:r>
-      <w:r>
-        <w:rPr>
-          <w:lang w:val="fr-FR"/>
-        </w:rPr>
-        <w:t xml:space="preserve"> D’une part, il s’agirait de rapprocher le traitement fiscal de placements comparables et limiter les avantages liés au choix d’une enveloppe plutôt qu’à la nature économique du revenu. D’autre part, refonder la fiscalité des transmissions, aujourd’hui complexe et vectrice d’inégalités. Une piste serait de l’organiser autour de quatre principes. Un abattement unique, élevé, valable pour la vie entière, qui affranchisse l’immense majorité et le lui dise d’avance. Un barème unique, plus faible mais effectif, appliqué au cumul reçu par chacun en contrepartie de la suppression des niches, et qui rende enfin sa liberté au geste de transmettre à qui l’on veut. Des taux réduits pour les transmissions reçues tôt, afin d’orienter le capital vers l’âge où il féconde une vie. Un seul régime dérogatoire pour les transmissions d’entreprise mais recentré sur le seul outil productif, plafonné et conditionné, à l’allemande pour protéger en priorité nos TPE et PME.</w:t>
+        <w:t xml:space="preserve">Capital : rechercher la neutralité et moins taxer son accumulation que sa transmission.</w:t>
+      </w:r>
+      <w:r>
+        <w:rPr>
+          <w:lang w:val="fr-FR"/>
+        </w:rPr>
+        <w:t xml:space="preserve"> D’une part, il s’agirait de rapprocher le traitement fiscal de placements comparables et limiter les avantages liés au choix d’une enveloppe plutôt qu’à la nature économique du revenu. D’autre part, refonder la fiscalité des transmissions, aujourd’hui complexe et vectrice d’inégalités (voir l’encadré).</w:t>
+      </w:r>
+    </w:p>
+    <w:p>
+      <w:pPr>
+        <w:keepNext/>
+        <w:pBdr>
+          <w:left w:val="single" w:color="003399" w:sz="24" w:space="10"/>
+        </w:pBdr>
+        <w:shd w:fill="EEF2FA" w:color="auto" w:val="clear"/>
+        <w:spacing w:after="60" w:before="160"/>
+        <w:ind w:left="520" w:right="120"/>
+      </w:pPr>
+      <w:r>
+        <w:rPr>
+          <w:b/>
+          <w:bCs/>
+          <w:color w:val="003399"/>
+          <w:lang w:val="fr-FR"/>
+        </w:rPr>
+        <w:t xml:space="preserve">Encadré : refonder la fiscalité des transmissions</w:t>
+      </w:r>
+    </w:p>
+    <w:p>
+      <w:pPr>
+        <w:keepNext/>
+        <w:pBdr>
+          <w:left w:val="single" w:color="003399" w:sz="24" w:space="10"/>
+        </w:pBdr>
+        <w:shd w:fill="EEF2FA" w:color="auto" w:val="clear"/>
+        <w:spacing w:after="60"/>
+        <w:ind w:left="520" w:right="120"/>
+      </w:pPr>
+      <w:r>
+        <w:rPr>
+          <w:lang w:val="fr-FR"/>
+        </w:rPr>
+        <w:t xml:space="preserve">La fiscalité des transmissions pourrait s’organiser autour de quatre principes :</w:t>
+      </w:r>
+    </w:p>
+    <w:p>
+      <w:pPr>
+        <w:keepNext/>
+        <w:pBdr>
+          <w:left w:val="single" w:color="003399" w:sz="24" w:space="10"/>
+        </w:pBdr>
+        <w:shd w:fill="EEF2FA" w:color="auto" w:val="clear"/>
+        <w:spacing w:after="60"/>
+        <w:ind w:left="520" w:right="120"/>
+      </w:pPr>
+      <w:r>
+        <w:rPr>
+          <w:color w:val="003399"/>
+          <w:lang w:val="fr-FR"/>
+        </w:rPr>
+        <w:t xml:space="preserve">▪ </w:t>
+      </w:r>
+      <w:r>
+        <w:rPr>
+          <w:lang w:val="fr-FR"/>
+        </w:rPr>
+        <w:t xml:space="preserve">Un abattement unique, élevé, valable pour la vie entière, qui affranchisse l’immense majorité et le lui dise d’avance.</w:t>
+      </w:r>
+    </w:p>
+    <w:p>
+      <w:pPr>
+        <w:keepNext/>
+        <w:pBdr>
+          <w:left w:val="single" w:color="003399" w:sz="24" w:space="10"/>
+        </w:pBdr>
+        <w:shd w:fill="EEF2FA" w:color="auto" w:val="clear"/>
+        <w:spacing w:after="60"/>
+        <w:ind w:left="520" w:right="120"/>
+      </w:pPr>
+      <w:r>
+        <w:rPr>
+          <w:color w:val="003399"/>
+          <w:lang w:val="fr-FR"/>
+        </w:rPr>
+        <w:t xml:space="preserve">▪ </w:t>
+      </w:r>
+      <w:r>
+        <w:rPr>
+          <w:lang w:val="fr-FR"/>
+        </w:rPr>
+        <w:t xml:space="preserve">Un barème unique, plus faible mais effectif, appliqué au cumul reçu par chacun en contrepartie de la suppression des niches, et qui rende enfin sa liberté au geste de transmettre à qui l’on veut.</w:t>
+      </w:r>
+    </w:p>
+    <w:p>
+      <w:pPr>
+        <w:keepNext/>
+        <w:pBdr>
+          <w:left w:val="single" w:color="003399" w:sz="24" w:space="10"/>
+        </w:pBdr>
+        <w:shd w:fill="EEF2FA" w:color="auto" w:val="clear"/>
+        <w:spacing w:after="60"/>
+        <w:ind w:left="520" w:right="120"/>
+      </w:pPr>
+      <w:r>
+        <w:rPr>
+          <w:color w:val="003399"/>
+          <w:lang w:val="fr-FR"/>
+        </w:rPr>
+        <w:t xml:space="preserve">▪ </w:t>
+      </w:r>
+      <w:r>
+        <w:rPr>
+          <w:lang w:val="fr-FR"/>
+        </w:rPr>
+        <w:t xml:space="preserve">Des taux réduits pour les transmissions reçues tôt, afin d’orienter le capital vers l’âge où il féconde une vie.</w:t>
+      </w:r>
+    </w:p>
+    <w:p>
+      <w:pPr>
+        <w:keepNext/>
+        <w:pBdr>
+          <w:left w:val="single" w:color="003399" w:sz="24" w:space="10"/>
+        </w:pBdr>
+        <w:shd w:fill="EEF2FA" w:color="auto" w:val="clear"/>
+        <w:spacing w:after="60"/>
+        <w:ind w:left="520" w:right="120"/>
+      </w:pPr>
+      <w:r>
+        <w:rPr>
+          <w:color w:val="003399"/>
+          <w:lang w:val="fr-FR"/>
+        </w:rPr>
+        <w:t xml:space="preserve">▪ </w:t>
+      </w:r>
+      <w:r>
+        <w:rPr>
+          <w:lang w:val="fr-FR"/>
+        </w:rPr>
+        <w:t xml:space="preserve">Un seul régime dérogatoire pour les transmissions d’entreprise mais recentré sur le seul outil productif, plafonné et conditionné, à l’allemande pour protéger en priorité nos TPE et PME.</w:t>
+      </w:r>
+    </w:p>
+    <w:p>
+      <w:pPr>
+        <w:pBdr>
+          <w:left w:val="single" w:color="003399" w:sz="24" w:space="10"/>
+        </w:pBdr>
+        <w:shd w:fill="EEF2FA" w:color="auto" w:val="clear"/>
+        <w:spacing w:after="160"/>
+        <w:ind w:left="520" w:right="120"/>
+      </w:pPr>
+      <w:r>
+        <w:rPr>
+          <w:i/>
+          <w:iCs/>
+          <w:lang w:val="fr-FR"/>
+        </w:rPr>
+        <w:t xml:space="preserve">Une telle réforme reste difficile à conduire. Politiquement, l’imposition des successions est l’un des prélèvements les plus rejetés par l’opinion. Économiquement, elle se heurte aux stratégies d’anticipation (donations, démembrements de propriété), à la mobilité des patrimoines et aux difficultés d’évaluation et de liquidité lors des transmissions d’entreprise.</w:t>
       </w:r>
     </w:p>
     <w:p>
@@ -1403,7 +1560,13 @@
         <w:rPr>
           <w:lang w:val="fr-FR"/>
         </w:rPr>
-        <w:t xml:space="preserve"> À commencer par la fiscalité carbone, puis le tabac et le sucre.</w:t>
+        <w:t xml:space="preserve"> À commencer par la fiscalité carbone.</w:t>
+      </w:r>
+      <w:r>
+        <w:rPr>
+          <w:rStyle w:val="FootnoteReference"/>
+        </w:rPr>
+        <w:footnoteReference w:id="8"/>
       </w:r>
     </w:p>
     <w:p>
@@ -1563,13 +1726,13 @@
           <w:bCs/>
           <w:lang w:val="fr-FR"/>
         </w:rPr>
-        <w:t xml:space="preserve">Réformer par paquets cohérents, votés ensemble.</w:t>
-      </w:r>
-      <w:r>
-        <w:rPr>
-          <w:lang w:val="fr-FR"/>
-        </w:rPr>
-        <w:t xml:space="preserve"> Une suppression de niche doit être accompagnée de la baisse de taux qu’elle finance ; une hausse de TVA, de la baisse de cotisations correspondante. Hausses, baisses et compensations doivent être votées ensemble pour éviter que seules les premières soient effectivement mises en œuvre : une réforme d’ensemble, aux éléments indissociables, qui appelle un mandat clair.</w:t>
+        <w:t xml:space="preserve">Réformer par paquets cohérents.</w:t>
+      </w:r>
+      <w:r>
+        <w:rPr>
+          <w:lang w:val="fr-FR"/>
+        </w:rPr>
+        <w:t xml:space="preserve"> Une suppression de niche doit être accompagnée de la baisse de taux qu’elle finance ; une hausse de TVA, de la baisse de cotisations correspondante.</w:t>
       </w:r>
     </w:p>
     <w:p>
@@ -1621,7 +1784,30 @@
         <w:rPr>
           <w:rStyle w:val="FootnoteReference"/>
         </w:rPr>
-        <w:footnoteReference w:id="7"/>
+        <w:footnoteReference w:id="9"/>
+      </w:r>
+    </w:p>
+    <w:p>
+      <w:pPr>
+        <w:pStyle w:val="ListParagraph"/>
+        <w:numPr>
+          <w:ilvl w:val="0"/>
+          <w:numId w:val="2"/>
+        </w:numPr>
+      </w:pPr>
+      <w:r>
+        <w:rPr>
+          <w:b/>
+          <w:bCs/>
+          <w:lang w:val="fr-FR"/>
+        </w:rPr>
+        <w:t xml:space="preserve">Rendre la réforme crédible.</w:t>
+      </w:r>
+      <w:r>
+        <w:rPr>
+          <w:lang w:val="fr-FR"/>
+        </w:rPr>
+        <w:t xml:space="preserve"> Hausses, baisses et compensations doivent être votées ensemble pour éviter que seules les premières soient effectivement mises en œuvre : une réforme d’ensemble, aux éléments indissociables, qui appelle un mandat clair.</w:t>
       </w:r>
     </w:p>
     <w:p>
@@ -1644,7 +1830,7 @@
         <w:rPr>
           <w:lang w:val="fr-FR"/>
         </w:rPr>
-        <w:t xml:space="preserve"> Commencer par ce qui se finance de soi-même (le troc aides contre impôts de production, la TVA sociale) avant les réformes dont le rendement est plus long à venir.</w:t>
+        <w:t xml:space="preserve"> Commencer par ce qui se finance de soi-même — le troc aides contre impôts de production, la TVA sociale — avant les réformes dont le rendement est plus long à venir.</w:t>
       </w:r>
     </w:p>
     <w:p>
@@ -1727,7 +1913,7 @@
         <w:rPr>
           <w:lang w:val="fr-FR"/>
         </w:rPr>
-        <w:t xml:space="preserve"> Soit les cotisations patronales, ce qui réduit directement le coût du travail ; soit les prélèvements salariés (CSG d’activité ou cotisations vieillesse), ce qui relève le salaire net sans baisser directement le coût du travail.</w:t>
+        <w:t xml:space="preserve"> Soit les cotisations patronales, ce qui réduit directement le coût du travail ; soit les prélèvements salariés — CSG d’activité ou cotisations vieillesse —, ce qui relève le salaire net sans baisser directement le coût du travail.</w:t>
       </w:r>
     </w:p>
     <w:p>
@@ -1796,7 +1982,7 @@
         <w:rPr>
           <w:lang w:val="fr-FR"/>
         </w:rPr>
-        <w:t xml:space="preserve"> Soit s’en tenir à l’assiette, pour que le taux affiché soit le taux payé ; soit rendre l’IS progressif : léger pour les petites entreprises, plus lourd pour les très grands bénéfices, apprécié au niveau du groupe pour éviter le fractionnement.</w:t>
+        <w:t xml:space="preserve"> Soit s’en tenir à l’assiette, pour que le taux affiché soit le taux payé ; soit rendre l’IS progressif — léger pour les petites entreprises, plus lourd pour les très grands bénéfices, apprécié au niveau du groupe pour éviter le fractionnement.</w:t>
       </w:r>
     </w:p>
     <w:p>
@@ -1842,7 +2028,7 @@
         <w:rPr>
           <w:lang w:val="fr-FR"/>
         </w:rPr>
-        <w:t xml:space="preserve"> Soit s’en tenir à leur fiscalité ; soit traiter aussi le système : départ à 65 ans et 45 années de cotisation, un étage de capitalisation pour tous, et une architecture où la solidarité (santé de base, famille, minima, autonomie) est financée par l’impôt, la retraite et le chômage par la cotisation.</w:t>
+        <w:t xml:space="preserve"> Soit s’en tenir à leur fiscalité ; soit traiter aussi le système : départ à 65 ans et 45 années de cotisation, un étage de capitalisation pour tous, et une architecture où la solidarité — santé de base, famille, minima, autonomie — est financée par l’impôt, la retraite et le chômage par la cotisation.</w:t>
       </w:r>
     </w:p>
     <w:p>
@@ -2051,7 +2237,7 @@
           <w:szCs w:val="17"/>
           <w:lang w:val="fr-FR"/>
         </w:rPr>
-        <w:t xml:space="preserve">Ou à financer par l’endettement, ce qui revient au même aux intérêts près, mais reporte l’arbitrage dans le temps.</w:t>
+        <w:t xml:space="preserve">Le système fiscal français pourrait être décrit plus sévèrement, comme essoufflé ou en voie de délitement : faute de simplicité, il cesse d’être juste ; il est fortement distorsif et désincitatif ; son rendement est élevé, mais ne suffit pas à couvrir la dépense.</w:t>
       </w:r>
     </w:p>
   </w:footnote>
@@ -2069,7 +2255,7 @@
           <w:szCs w:val="17"/>
           <w:lang w:val="fr-FR"/>
         </w:rPr>
-        <w:t xml:space="preserve">Deux tiers des Français jugent trop élevé le montant des impôts et taxes qu’ils paient, alors que moins d’un sur trois est satisfait de la qualité des services publics (Ipsos, mai 2023). 78 % jugent le niveau d’imposition trop élevé, et autant les cotisations sociales ; mais pour leur propre situation, 61 % estiment payer trop d’impôts, 36 % un bon niveau et 3 % trop peu, et 79 % voient dans le paiement des impôts et cotisations un acte citoyen (baromètre des prélèvements fiscaux et sociaux du CPO, novembre 2025). 59 % donnent la priorité à la baisse des impôts sur l’amélioration des services publics (baromètre Delouvrier, février 2026). 83 % jugent le système fiscal incompréhensible (BVA, 2016).</w:t>
+        <w:t xml:space="preserve">Ou à financer par l’endettement, ce qui revient au même aux intérêts près, mais reporte l’arbitrage dans le temps.</w:t>
       </w:r>
     </w:p>
   </w:footnote>
@@ -2087,7 +2273,7 @@
           <w:szCs w:val="17"/>
           <w:lang w:val="fr-FR"/>
         </w:rPr>
-        <w:t xml:space="preserve">Deux basculements pourraient être affichés plus nettement dans cette partie : de l’inactivité vers l’activité, et de la rente vers le risque et le travail.</w:t>
+        <w:t xml:space="preserve">Deux tiers des Français jugent trop élevé le montant des impôts et taxes qu’ils paient, alors que moins d’un sur trois est satisfait de la qualité des services publics (Ipsos, mai 2023). 78 % jugent le niveau d’imposition trop élevé, et autant les cotisations sociales ; mais pour leur propre situation, 61 % estiment payer trop d’impôts, 36 % un bon niveau et 3 % trop peu, et 79 % voient dans le paiement des impôts et cotisations un acte citoyen (baromètre des prélèvements fiscaux et sociaux du CPO, novembre 2025). 59 % donnent la priorité à la baisse des impôts sur l’amélioration des services publics (baromètre Delouvrier, février 2026). 83 % jugent le système fiscal incompréhensible (BVA, 2016).</w:t>
       </w:r>
     </w:p>
   </w:footnote>
@@ -2105,7 +2291,7 @@
           <w:szCs w:val="17"/>
           <w:lang w:val="fr-FR"/>
         </w:rPr>
-        <w:t xml:space="preserve">Le constat est celui d’un modèle essoufflé : complexe, mal compris, déséquilibré face à la croissance des dépenses, alors qu’il est issu de choix autrefois jugés modernes et performants. D’où l’idée de le repenser entièrement, en s’affranchissant des contraintes politiques et parlementaires du moment, pour partir du système idéal et simplifié le plus adapté à notre temps.</w:t>
+        <w:t xml:space="preserve">Deux basculements pourraient être affichés plus nettement dans cette partie : de l’inactivité vers l’activité, et de la rente vers le risque et le travail.</w:t>
       </w:r>
     </w:p>
   </w:footnote>
@@ -2123,11 +2309,47 @@
           <w:szCs w:val="17"/>
           <w:lang w:val="fr-FR"/>
         </w:rPr>
-        <w:t xml:space="preserve">Question à discuter : ce basculement revient-il à faire passer la protection sociale d’un modèle bismarckien, financé par les cotisations, à un modèle beveridgien, financé par l’impôt ?</w:t>
+        <w:t xml:space="preserve">Le constat est celui d’un modèle essoufflé : complexe, mal compris, déséquilibré face à la croissance des dépenses, alors qu’il est issu de choix autrefois jugés modernes et performants. D’où l’idée de le repenser entièrement, en s’affranchissant des contraintes politiques et parlementaires du moment, pour partir du système idéal et simplifié le plus adapté à notre temps.</w:t>
       </w:r>
     </w:p>
   </w:footnote>
   <w:footnote w:id="7">
+    <w:p>
+      <w:r>
+        <w:rPr>
+          <w:rStyle w:val="FootnoteReference"/>
+        </w:rPr>
+        <w:footnoteRef/>
+      </w:r>
+      <w:r>
+        <w:rPr>
+          <w:sz w:val="17"/>
+          <w:szCs w:val="17"/>
+          <w:lang w:val="fr-FR"/>
+        </w:rPr>
+        <w:t xml:space="preserve">Question à discuter : ce basculement revient-il à faire passer la protection sociale d’un modèle bismarckien, financé par les cotisations, à un modèle beveridgien, financé par l’impôt ?</w:t>
+      </w:r>
+    </w:p>
+  </w:footnote>
+  <w:footnote w:id="8">
+    <w:p>
+      <w:r>
+        <w:rPr>
+          <w:rStyle w:val="FootnoteReference"/>
+        </w:rPr>
+        <w:footnoteRef/>
+      </w:r>
+      <w:r>
+        <w:rPr>
+          <w:sz w:val="17"/>
+          <w:szCs w:val="17"/>
+          <w:lang w:val="fr-FR"/>
+        </w:rPr>
+        <w:t xml:space="preserve">La liste pourrait inclure le tabac, le sucre et d’autres consommations nocives : ces taxes corrigent un coût collectif et allègent aussi, à terme, les dépenses de santé, voire améliorent la productivité.</w:t>
+      </w:r>
+    </w:p>
+  </w:footnote>
+  <w:footnote w:id="9">
     <w:p>
       <w:r>
         <w:rPr>
@@ -2210,7 +2432,7 @@
         <w:szCs w:val="16"/>
         <w:lang w:val="fr-FR"/>
       </w:rPr>
-      <w:t xml:space="preserve">, proposition de plan</w:t>
+      <w:t xml:space="preserve"> — proposition de plan</w:t>
     </w:r>
   </w:p>
 </w:hdr>

</xml_diff>